<commit_message>
Bài 70m2 bản 2: sửa theo 6 bình luận của Trang
- Bỏ cụm "giữ gì — mất gì", thay bằng "nên bố trí gì — nên bỏ gì" ở sapo
  và ở cột bảng mục 2.1
- Rà lại toàn bộ 32 heading, chèn từ khóa chính hoặc từ khóa mở rộng
- Viết lại tiêu đề mục 1.3 và mục 2 cho dễ hiểu hơn
- Bỏ 16 nhãn "Giới thiệu chung" và "Chứng minh" ở mục 4 và mục 5,
  sửa hai câu dẫn nhắc tới cấu trúc ba phần
- Bỏ tiêu đề phần kết, gộp ba con số thành một đoạn văn kết bài

Co-Authored-By: Claude Opus 5 <noreply@anthropic.com>
Claude-Session: https://claude.ai/code/session_01RQ7hSiqgQAkqf6RgYNY3Pj
</commit_message>
<xml_diff>
--- a/Kết quả công việc Agent Boss/Viec that - Phan tich SEO van phong 70m2/bai-viet/bai-viet-thiet-ke-van-phong-70m2.docx
+++ b/Kết quả công việc Agent Boss/Viec that - Phan tich SEO van phong 70m2/bai-viet/bai-viet-thiet-ke-van-phong-70m2.docx
@@ -83,7 +83,7 @@
           <w:i w:val="0"/>
           <w:sz w:val="25"/>
         </w:rPr>
-        <w:t>Bài viết đưa bảng phân bổ diện tích từng khu, bảng "giữ gì — mất gì", ba sơ đồ mặt bằng vẽ theo ba hình dạng thực tế, các mẫu thiết kế theo phong cách và chi phí tham khảo theo giá thị trường — để doanh nghiệp có căn cứ chốt phương án ngay từ đầu.</w:t>
+        <w:t>Bài viết đưa bảng phân bổ diện tích từng khu, bảng nên bố trí những gì và nên bỏ bớt những gì, ba sơ đồ mặt bằng vẽ theo ba hình dạng thực tế, các mẫu thiết kế theo phong cách và chi phí tham khảo theo giá thị trường — để doanh nghiệp có căn cứ chốt phương án ngay từ đầu.</w:t>
       </w:r>
     </w:p>
     <w:p>
@@ -183,7 +183,7 @@
           <w:color w:val="1F2A44"/>
           <w:sz w:val="27"/>
         </w:rPr>
-        <w:t>1.1. Ba mức bố trí và số chỗ ngồi tương ứng</w:t>
+        <w:t>1.1. Ba mức bố trí văn phòng 70m2 và số chỗ ngồi tương ứng</w:t>
       </w:r>
     </w:p>
     <w:p>
@@ -540,7 +540,7 @@
           <w:color w:val="1F2A44"/>
           <w:sz w:val="27"/>
         </w:rPr>
-        <w:t>1.2. Vì sao mỗi nơi lại nói một con số khác nhau?</w:t>
+        <w:t>1.2. Vì sao mỗi nơi nói một con số nhân sự khác nhau cho văn phòng 70m2?</w:t>
       </w:r>
     </w:p>
     <w:p>
@@ -672,7 +672,7 @@
           <w:color w:val="1F2A44"/>
           <w:sz w:val="27"/>
         </w:rPr>
-        <w:t>1.3. Ở 70m2, cách chia quan trọng hơn diện tích</w:t>
+        <w:t>1.3. Bố trí văn phòng 70m2: cách chia quyết định số chỗ ngồi</w:t>
       </w:r>
     </w:p>
     <w:p>
@@ -772,7 +772,7 @@
           <w:color w:val="0B3D91"/>
           <w:sz w:val="32"/>
         </w:rPr>
-        <w:t>2. Ở 70m2, giữ thêm một phòng riêng là mất mấy chỗ ngồi?</w:t>
+        <w:t>2. Bố trí văn phòng 70m2: giữ thêm một phòng riêng là mất mấy chỗ ngồi?</w:t>
       </w:r>
     </w:p>
     <w:p>
@@ -1112,7 +1112,7 @@
           <w:color w:val="1F2A44"/>
           <w:sz w:val="27"/>
         </w:rPr>
-        <w:t>2.1. Ba tổ hợp thường dùng theo loại hình doanh nghiệp</w:t>
+        <w:t>2.1. Ba cách bố trí văn phòng 70m2 theo loại hình doanh nghiệp</w:t>
       </w:r>
     </w:p>
     <w:p>
@@ -1159,7 +1159,7 @@
                 <w:color w:val="FFFFFF"/>
                 <w:sz w:val="21"/>
               </w:rPr>
-              <w:t>Tổ hợp</w:t>
+              <w:t>Cách bố trí</w:t>
             </w:r>
           </w:p>
         </w:tc>
@@ -1178,7 +1178,7 @@
                 <w:color w:val="FFFFFF"/>
                 <w:sz w:val="21"/>
               </w:rPr>
-              <w:t>Giữ gì — bỏ gì</w:t>
+              <w:t>Nên bố trí gì — nên bỏ gì</w:t>
             </w:r>
           </w:p>
         </w:tc>
@@ -1541,7 +1541,7 @@
           <w:color w:val="0B3D91"/>
           <w:sz w:val="32"/>
         </w:rPr>
-        <w:t>3. Chia 70m2 thành những khu nào? Bảng phân bổ và 3 sơ đồ mặt bằng</w:t>
+        <w:t>3. Bố trí văn phòng 70m2: bảng phân bổ diện tích và 3 sơ đồ mặt bằng</w:t>
       </w:r>
     </w:p>
     <w:p>
@@ -1571,7 +1571,7 @@
           <w:color w:val="1F2A44"/>
           <w:sz w:val="27"/>
         </w:rPr>
-        <w:t>3.1. Bảng phân bổ diện tích chuẩn cho 70m²</w:t>
+        <w:t>3.1. Bảng phân bổ diện tích chuẩn cho văn phòng 70m2</w:t>
       </w:r>
     </w:p>
     <w:tbl>
@@ -1986,7 +1986,7 @@
           <w:color w:val="1F2A44"/>
           <w:sz w:val="27"/>
         </w:rPr>
-        <w:t>3.2. Ba sơ đồ mặt bằng — cùng 70m2, chênh nhau 2 chỗ ngồi</w:t>
+        <w:t>3.2. Ba sơ đồ mặt bằng văn phòng 70m2 — cùng diện tích, chênh nhau 2 chỗ ngồi</w:t>
       </w:r>
     </w:p>
     <w:p>
@@ -2723,7 +2723,7 @@
           <w:i w:val="0"/>
           <w:sz w:val="24"/>
         </w:rPr>
-        <w:t>Phong cách không chỉ là chuyện đẹp xấu. Ở mặt bằng 70m², phong cách quyết định luôn cả số chỗ ngồi: phong cách nào dùng nhiều vách đặc và nội thất khối lớn thì mất chỗ, phong cách nào dùng kính và nội thất nhẹ thì giữ được chỗ. Năm phong cách dưới đây được doanh nghiệp chọn nhiều nhất cho diện tích này. Mỗi phong cách đều trình bày theo ba phần: giới thiệu chung, ưu điểm, và chứng minh bằng con số.</w:t>
+        <w:t>Phong cách không chỉ là chuyện đẹp xấu. Ở mặt bằng 70m², phong cách quyết định luôn cả số chỗ ngồi: phong cách nào dùng nhiều vách đặc và nội thất khối lớn thì mất chỗ, phong cách nào dùng kính và nội thất nhẹ thì giữ được chỗ. Năm phong cách dưới đây được doanh nghiệp chọn nhiều nhất cho diện tích này — kèm con số cụ thể cho thấy mỗi phong cách giữ lại hay lấy đi bao nhiêu chỗ ngồi.</w:t>
       </w:r>
     </w:p>
     <w:p>
@@ -2738,22 +2738,7 @@
           <w:color w:val="1F2A44"/>
           <w:sz w:val="27"/>
         </w:rPr>
-        <w:t>4.1. Phong cách hiện đại</w:t>
-      </w:r>
-    </w:p>
-    <w:p>
-      <w:pPr>
-        <w:spacing w:before="160" w:after="40"/>
-      </w:pPr>
-      <w:r>
-        <w:rPr>
-          <w:rFonts w:ascii="Times New Roman" w:hAnsi="Times New Roman"/>
-          <w:b/>
-          <w:i w:val="0"/>
-          <w:color w:val="0D6E4F"/>
-          <w:sz w:val="24"/>
-        </w:rPr>
-        <w:t>Giới thiệu chung</w:t>
+        <w:t>4.1. Mẫu thiết kế văn phòng 70m2 phong cách hiện đại</w:t>
       </w:r>
     </w:p>
     <w:p>
@@ -2880,21 +2865,6 @@
           <w:sz w:val="24"/>
         </w:rPr>
         <w:t xml:space="preserve"> Vật liệu công nghiệp có sẵn theo mô-đun nên ít phát sinh gia công tại công trường.</w:t>
-      </w:r>
-    </w:p>
-    <w:p>
-      <w:pPr>
-        <w:spacing w:before="160" w:after="40"/>
-      </w:pPr>
-      <w:r>
-        <w:rPr>
-          <w:rFonts w:ascii="Times New Roman" w:hAnsi="Times New Roman"/>
-          <w:b/>
-          <w:i w:val="0"/>
-          <w:color w:val="0D6E4F"/>
-          <w:sz w:val="24"/>
-        </w:rPr>
-        <w:t>Chứng minh</w:t>
       </w:r>
     </w:p>
     <w:p>
@@ -3199,22 +3169,7 @@
           <w:color w:val="1F2A44"/>
           <w:sz w:val="27"/>
         </w:rPr>
-        <w:t>4.2. Phong cách tối giản (Minimalism)</w:t>
-      </w:r>
-    </w:p>
-    <w:p>
-      <w:pPr>
-        <w:spacing w:before="160" w:after="40"/>
-      </w:pPr>
-      <w:r>
-        <w:rPr>
-          <w:rFonts w:ascii="Times New Roman" w:hAnsi="Times New Roman"/>
-          <w:b/>
-          <w:i w:val="0"/>
-          <w:color w:val="0D6E4F"/>
-          <w:sz w:val="24"/>
-        </w:rPr>
-        <w:t>Giới thiệu chung</w:t>
+        <w:t>4.2. Mẫu thiết kế văn phòng 70m2 phong cách tối giản (Minimalism)</w:t>
       </w:r>
     </w:p>
     <w:p>
@@ -3341,21 +3296,6 @@
           <w:sz w:val="24"/>
         </w:rPr>
         <w:t xml:space="preserve"> Hạng mục chủ yếu là nội thất rời, hết hạn thuê tháo mang đi được.</w:t>
-      </w:r>
-    </w:p>
-    <w:p>
-      <w:pPr>
-        <w:spacing w:before="160" w:after="40"/>
-      </w:pPr>
-      <w:r>
-        <w:rPr>
-          <w:rFonts w:ascii="Times New Roman" w:hAnsi="Times New Roman"/>
-          <w:b/>
-          <w:i w:val="0"/>
-          <w:color w:val="0D6E4F"/>
-          <w:sz w:val="24"/>
-        </w:rPr>
-        <w:t>Chứng minh</w:t>
       </w:r>
     </w:p>
     <w:p>
@@ -3660,22 +3600,7 @@
           <w:color w:val="1F2A44"/>
           <w:sz w:val="27"/>
         </w:rPr>
-        <w:t>4.3. Phong cách xanh (Eco / Green Office)</w:t>
-      </w:r>
-    </w:p>
-    <w:p>
-      <w:pPr>
-        <w:spacing w:before="160" w:after="40"/>
-      </w:pPr>
-      <w:r>
-        <w:rPr>
-          <w:rFonts w:ascii="Times New Roman" w:hAnsi="Times New Roman"/>
-          <w:b/>
-          <w:i w:val="0"/>
-          <w:color w:val="0D6E4F"/>
-          <w:sz w:val="24"/>
-        </w:rPr>
-        <w:t>Giới thiệu chung</w:t>
+        <w:t>4.3. Mẫu thiết kế văn phòng 70m2 phong cách xanh (Eco / Green Office)</w:t>
       </w:r>
     </w:p>
     <w:p>
@@ -3802,21 +3727,6 @@
           <w:sz w:val="24"/>
         </w:rPr>
         <w:t xml:space="preserve"> Khách và đối tác nhìn thấy ngay khi bước vào.</w:t>
-      </w:r>
-    </w:p>
-    <w:p>
-      <w:pPr>
-        <w:spacing w:before="160" w:after="40"/>
-      </w:pPr>
-      <w:r>
-        <w:rPr>
-          <w:rFonts w:ascii="Times New Roman" w:hAnsi="Times New Roman"/>
-          <w:b/>
-          <w:i w:val="0"/>
-          <w:color w:val="0D6E4F"/>
-          <w:sz w:val="24"/>
-        </w:rPr>
-        <w:t>Chứng minh</w:t>
       </w:r>
     </w:p>
     <w:p>
@@ -4121,22 +4031,7 @@
           <w:color w:val="1F2A44"/>
           <w:sz w:val="27"/>
         </w:rPr>
-        <w:t>4.4. Không gian mở (Open Office)</w:t>
-      </w:r>
-    </w:p>
-    <w:p>
-      <w:pPr>
-        <w:spacing w:before="160" w:after="40"/>
-      </w:pPr>
-      <w:r>
-        <w:rPr>
-          <w:rFonts w:ascii="Times New Roman" w:hAnsi="Times New Roman"/>
-          <w:b/>
-          <w:i w:val="0"/>
-          <w:color w:val="0D6E4F"/>
-          <w:sz w:val="24"/>
-        </w:rPr>
-        <w:t>Giới thiệu chung</w:t>
+        <w:t>4.4. Mẫu thiết kế văn phòng 70m2 không gian mở (Open Office)</w:t>
       </w:r>
     </w:p>
     <w:p>
@@ -4263,21 +4158,6 @@
           <w:sz w:val="24"/>
         </w:rPr>
         <w:t xml:space="preserve"> Không có vách chặn nên vị trí ngồi trong cùng vẫn đủ sáng.</w:t>
-      </w:r>
-    </w:p>
-    <w:p>
-      <w:pPr>
-        <w:spacing w:before="160" w:after="40"/>
-      </w:pPr>
-      <w:r>
-        <w:rPr>
-          <w:rFonts w:ascii="Times New Roman" w:hAnsi="Times New Roman"/>
-          <w:b/>
-          <w:i w:val="0"/>
-          <w:color w:val="0D6E4F"/>
-          <w:sz w:val="24"/>
-        </w:rPr>
-        <w:t>Chứng minh</w:t>
       </w:r>
     </w:p>
     <w:p>
@@ -4582,22 +4462,7 @@
           <w:color w:val="1F2A44"/>
           <w:sz w:val="27"/>
         </w:rPr>
-        <w:t>4.5. Phong cách công nghiệp (Industrial)</w:t>
-      </w:r>
-    </w:p>
-    <w:p>
-      <w:pPr>
-        <w:spacing w:before="160" w:after="40"/>
-      </w:pPr>
-      <w:r>
-        <w:rPr>
-          <w:rFonts w:ascii="Times New Roman" w:hAnsi="Times New Roman"/>
-          <w:b/>
-          <w:i w:val="0"/>
-          <w:color w:val="0D6E4F"/>
-          <w:sz w:val="24"/>
-        </w:rPr>
-        <w:t>Giới thiệu chung</w:t>
+        <w:t>4.5. Mẫu thiết kế văn phòng 70m2 phong cách công nghiệp (Industrial)</w:t>
       </w:r>
     </w:p>
     <w:p>
@@ -4724,21 +4589,6 @@
           <w:sz w:val="24"/>
         </w:rPr>
         <w:t xml:space="preserve"> Vật liệu thô ít lộ dấu sử dụng hơn bề mặt sơn phẳng.</w:t>
-      </w:r>
-    </w:p>
-    <w:p>
-      <w:pPr>
-        <w:spacing w:before="160" w:after="40"/>
-      </w:pPr>
-      <w:r>
-        <w:rPr>
-          <w:rFonts w:ascii="Times New Roman" w:hAnsi="Times New Roman"/>
-          <w:b/>
-          <w:i w:val="0"/>
-          <w:color w:val="0D6E4F"/>
-          <w:sz w:val="24"/>
-        </w:rPr>
-        <w:t>Chứng minh</w:t>
       </w:r>
     </w:p>
     <w:p>
@@ -5058,7 +4908,7 @@
           <w:i w:val="0"/>
           <w:sz w:val="24"/>
         </w:rPr>
-        <w:t xml:space="preserve">Phong cách là thứ doanh nghiệp được chọn. Hình dạng mặt bằng thì không — nó đã có sẵn khi ký hợp đồng thuê. Ba dạng dưới đây là ba hình dạng 70m² hay gặp nhất, tương ứng với ba sơ đồ ở mục 3. Mỗi dạng trình bày theo ba phần: giới thiệu chung, ưu điểm, chứng minh — và quan trọng nhất là </w:t>
+        <w:t xml:space="preserve">Phong cách là thứ doanh nghiệp được chọn. Hình dạng mặt bằng thì không — nó đã có sẵn khi ký hợp đồng thuê. Ba dạng dưới đây là ba hình dạng 70m² hay gặp nhất, tương ứng với ba sơ đồ ở mục 3. Với mỗi dạng, phần quan trọng nhất là </w:t>
       </w:r>
       <w:r>
         <w:rPr>
@@ -5067,7 +4917,7 @@
           <w:i w:val="0"/>
           <w:sz w:val="24"/>
         </w:rPr>
-        <w:t>dạng này ép doanh nghiệp phải bỏ gì</w:t>
+        <w:t>dạng đó ép doanh nghiệp phải bỏ gì</w:t>
       </w:r>
       <w:r>
         <w:rPr>
@@ -5076,7 +4926,7 @@
           <w:i w:val="0"/>
           <w:sz w:val="24"/>
         </w:rPr>
-        <w:t>.</w:t>
+        <w:t xml:space="preserve"> để đủ chỗ ngồi.</w:t>
       </w:r>
     </w:p>
     <w:p>
@@ -5091,22 +4941,7 @@
           <w:color w:val="1F2A44"/>
           <w:sz w:val="27"/>
         </w:rPr>
-        <w:t>5.1. Văn phòng hẹp và dài</w:t>
-      </w:r>
-    </w:p>
-    <w:p>
-      <w:pPr>
-        <w:spacing w:before="160" w:after="40"/>
-      </w:pPr>
-      <w:r>
-        <w:rPr>
-          <w:rFonts w:ascii="Times New Roman" w:hAnsi="Times New Roman"/>
-          <w:b/>
-          <w:i w:val="0"/>
-          <w:color w:val="0D6E4F"/>
-          <w:sz w:val="24"/>
-        </w:rPr>
-        <w:t>Giới thiệu chung</w:t>
+        <w:t>5.1. Mẫu văn phòng 70m2 mặt bằng hẹp và dài</w:t>
       </w:r>
     </w:p>
     <w:p>
@@ -5233,21 +5068,6 @@
           <w:sz w:val="24"/>
         </w:rPr>
         <w:t xml:space="preserve"> Tiếng họp không lọt sang phòng lãnh đạo.</w:t>
-      </w:r>
-    </w:p>
-    <w:p>
-      <w:pPr>
-        <w:spacing w:before="160" w:after="40"/>
-      </w:pPr>
-      <w:r>
-        <w:rPr>
-          <w:rFonts w:ascii="Times New Roman" w:hAnsi="Times New Roman"/>
-          <w:b/>
-          <w:i w:val="0"/>
-          <w:color w:val="0D6E4F"/>
-          <w:sz w:val="24"/>
-        </w:rPr>
-        <w:t>Chứng minh — và dạng này ép bạn bỏ gì</w:t>
       </w:r>
     </w:p>
     <w:p>
@@ -5576,22 +5396,7 @@
           <w:color w:val="1F2A44"/>
           <w:sz w:val="27"/>
         </w:rPr>
-        <w:t>5.2. Văn phòng vuông cân xứng</w:t>
-      </w:r>
-    </w:p>
-    <w:p>
-      <w:pPr>
-        <w:spacing w:before="160" w:after="40"/>
-      </w:pPr>
-      <w:r>
-        <w:rPr>
-          <w:rFonts w:ascii="Times New Roman" w:hAnsi="Times New Roman"/>
-          <w:b/>
-          <w:i w:val="0"/>
-          <w:color w:val="0D6E4F"/>
-          <w:sz w:val="24"/>
-        </w:rPr>
-        <w:t>Giới thiệu chung</w:t>
+        <w:t>5.2. Mẫu văn phòng 70m2 mặt bằng vuông cân xứng</w:t>
       </w:r>
     </w:p>
     <w:p>
@@ -5718,21 +5523,6 @@
           <w:sz w:val="24"/>
         </w:rPr>
         <w:t xml:space="preserve"> Thêm một dãy bàn không phá vỡ bố cục tổng thể.</w:t>
-      </w:r>
-    </w:p>
-    <w:p>
-      <w:pPr>
-        <w:spacing w:before="160" w:after="40"/>
-      </w:pPr>
-      <w:r>
-        <w:rPr>
-          <w:rFonts w:ascii="Times New Roman" w:hAnsi="Times New Roman"/>
-          <w:b/>
-          <w:i w:val="0"/>
-          <w:color w:val="0D6E4F"/>
-          <w:sz w:val="24"/>
-        </w:rPr>
-        <w:t>Chứng minh — và dạng này ép bạn bỏ gì</w:t>
       </w:r>
     </w:p>
     <w:p>
@@ -6061,22 +5851,7 @@
           <w:color w:val="1F2A44"/>
           <w:sz w:val="27"/>
         </w:rPr>
-        <w:t>5.3. Văn phòng lô góc</w:t>
-      </w:r>
-    </w:p>
-    <w:p>
-      <w:pPr>
-        <w:spacing w:before="160" w:after="40"/>
-      </w:pPr>
-      <w:r>
-        <w:rPr>
-          <w:rFonts w:ascii="Times New Roman" w:hAnsi="Times New Roman"/>
-          <w:b/>
-          <w:i w:val="0"/>
-          <w:color w:val="0D6E4F"/>
-          <w:sz w:val="24"/>
-        </w:rPr>
-        <w:t>Giới thiệu chung</w:t>
+        <w:t>5.3. Mẫu văn phòng 70m2 mặt bằng lô góc</w:t>
       </w:r>
     </w:p>
     <w:p>
@@ -6203,21 +5978,6 @@
           <w:sz w:val="24"/>
         </w:rPr>
         <w:t xml:space="preserve"> Cửa sổ hai hướng cho phép tạo luồng khí đối lưu.</w:t>
-      </w:r>
-    </w:p>
-    <w:p>
-      <w:pPr>
-        <w:spacing w:before="160" w:after="40"/>
-      </w:pPr>
-      <w:r>
-        <w:rPr>
-          <w:rFonts w:ascii="Times New Roman" w:hAnsi="Times New Roman"/>
-          <w:b/>
-          <w:i w:val="0"/>
-          <w:color w:val="0D6E4F"/>
-          <w:sz w:val="24"/>
-        </w:rPr>
-        <w:t>Chứng minh — và dạng này ép bạn bỏ gì</w:t>
       </w:r>
     </w:p>
     <w:p>
@@ -7390,7 +7150,7 @@
           <w:color w:val="1F2A44"/>
           <w:sz w:val="27"/>
         </w:rPr>
-        <w:t>7.1. Năm yếu tố quyết định con số cuối cùng</w:t>
+        <w:t>7.1. Năm yếu tố quyết định chi phí thiết kế văn phòng 70m2</w:t>
       </w:r>
     </w:p>
     <w:p>
@@ -7525,7 +7285,7 @@
           <w:color w:val="1F2A44"/>
           <w:sz w:val="27"/>
         </w:rPr>
-        <w:t>7.2. Tiết kiệm ở đâu mà không mất vẻ chuyên nghiệp</w:t>
+        <w:t>7.2. Tiết kiệm chi phí ở đâu mà văn phòng 70m2 vẫn chuyên nghiệp</w:t>
       </w:r>
     </w:p>
     <w:p>
@@ -8023,24 +7783,18 @@
     </w:p>
     <w:p>
       <w:pPr>
-        <w:spacing w:before="400" w:after="160"/>
+        <w:spacing w:after="160"/>
+        <w:jc w:val="both"/>
       </w:pPr>
       <w:r>
         <w:rPr>
           <w:rFonts w:ascii="Times New Roman" w:hAnsi="Times New Roman"/>
-          <w:b/>
+          <w:b w:val="0"/>
           <w:i w:val="0"/>
-          <w:color w:val="0B3D91"/>
-          <w:sz w:val="32"/>
+          <w:sz w:val="24"/>
         </w:rPr>
-        <w:t>Kết lại: ba con số cần nhớ về thiết kế văn phòng 70m2</w:t>
+        <w:t xml:space="preserve">Tóm lại, một mặt bằng 70m² bố trí được 10 – 15 chỗ ngồi tùy vào việc doanh nghiệp giữ hay bỏ các phòng kín, và riêng hình dạng mặt bằng đã làm con số này chênh nhau khoảng 2 chỗ. Về ngân sách, phí thiết kế rơi vào 10,5 – 28 triệu, còn chi phí thi công là 175 – 490 triệu tùy gói vật liệu; toàn bộ quá trình từ khảo sát đến bàn giao mất khoảng 28 – 38 ngày. Điều quyết định không phải là 70m² rộng hay hẹp, mà là doanh nghiệp chọn bỏ đúng thứ ngay từ bản vẽ đầu tiên — </w:t>
       </w:r>
-    </w:p>
-    <w:p>
-      <w:pPr>
-        <w:pStyle w:val="ListBullet"/>
-        <w:spacing w:after="80"/>
-      </w:pPr>
       <w:r>
         <w:rPr>
           <w:rFonts w:ascii="Times New Roman" w:hAnsi="Times New Roman"/>
@@ -8048,7 +7802,7 @@
           <w:i w:val="0"/>
           <w:sz w:val="24"/>
         </w:rPr>
-        <w:t>Chỗ ngồi:</w:t>
+        <w:t>thiết kế văn phòng 70m2</w:t>
       </w:r>
       <w:r>
         <w:rPr>
@@ -8057,103 +7811,7 @@
           <w:i w:val="0"/>
           <w:sz w:val="24"/>
         </w:rPr>
-        <w:t xml:space="preserve"> 10 – 15 chỗ, tùy vào việc giữ hay bỏ phòng kín. Hình dạng mặt bằng làm chênh thêm khoảng 2 chỗ.</w:t>
-      </w:r>
-    </w:p>
-    <w:p>
-      <w:pPr>
-        <w:pStyle w:val="ListBullet"/>
-        <w:spacing w:after="80"/>
-      </w:pPr>
-      <w:r>
-        <w:rPr>
-          <w:rFonts w:ascii="Times New Roman" w:hAnsi="Times New Roman"/>
-          <w:b/>
-          <w:i w:val="0"/>
-          <w:sz w:val="24"/>
-        </w:rPr>
-        <w:t>Chi phí:</w:t>
-      </w:r>
-      <w:r>
-        <w:rPr>
-          <w:rFonts w:ascii="Times New Roman" w:hAnsi="Times New Roman"/>
-          <w:b w:val="0"/>
-          <w:i w:val="0"/>
-          <w:sz w:val="24"/>
-        </w:rPr>
-        <w:t xml:space="preserve"> phí thiết kế 10,5 – 28 triệu; thi công 175 – 490 triệu tùy gói.</w:t>
-      </w:r>
-    </w:p>
-    <w:p>
-      <w:pPr>
-        <w:pStyle w:val="ListBullet"/>
-        <w:spacing w:after="80"/>
-      </w:pPr>
-      <w:r>
-        <w:rPr>
-          <w:rFonts w:ascii="Times New Roman" w:hAnsi="Times New Roman"/>
-          <w:b/>
-          <w:i w:val="0"/>
-          <w:sz w:val="24"/>
-        </w:rPr>
-        <w:t>Thời gian:</w:t>
-      </w:r>
-      <w:r>
-        <w:rPr>
-          <w:rFonts w:ascii="Times New Roman" w:hAnsi="Times New Roman"/>
-          <w:b w:val="0"/>
-          <w:i w:val="0"/>
-          <w:sz w:val="24"/>
-        </w:rPr>
-        <w:t xml:space="preserve"> khoảng 28 – 38 ngày từ khảo sát đến bàn giao.</w:t>
-      </w:r>
-    </w:p>
-    <w:p>
-      <w:pPr>
-        <w:spacing w:after="160"/>
-        <w:jc w:val="both"/>
-      </w:pPr>
-      <w:r>
-        <w:rPr>
-          <w:rFonts w:ascii="Times New Roman" w:hAnsi="Times New Roman"/>
-          <w:b w:val="0"/>
-          <w:i w:val="0"/>
-          <w:sz w:val="24"/>
-        </w:rPr>
-        <w:t xml:space="preserve">Điều quyết định không phải là 70m² rộng hay hẹp, mà là doanh nghiệp chọn bỏ đúng thứ ngay từ bản vẽ đầu tiên. </w:t>
-      </w:r>
-      <w:r>
-        <w:rPr>
-          <w:rFonts w:ascii="Times New Roman" w:hAnsi="Times New Roman"/>
-          <w:b/>
-          <w:i w:val="0"/>
-          <w:sz w:val="24"/>
-        </w:rPr>
-        <w:t>Thiết kế văn phòng 70m2</w:t>
-      </w:r>
-      <w:r>
-        <w:rPr>
-          <w:rFonts w:ascii="Times New Roman" w:hAnsi="Times New Roman"/>
-          <w:b w:val="0"/>
-          <w:i w:val="0"/>
-          <w:sz w:val="24"/>
-        </w:rPr>
-        <w:t xml:space="preserve"> làm tốt là khi mỗi mét vuông bỏ đi đều đổi lại được một thứ doanh nghiệp thực sự cần.</w:t>
-      </w:r>
-    </w:p>
-    <w:p>
-      <w:pPr>
-        <w:spacing w:after="160"/>
-        <w:jc w:val="both"/>
-      </w:pPr>
-      <w:r>
-        <w:rPr>
-          <w:rFonts w:ascii="Times New Roman" w:hAnsi="Times New Roman"/>
-          <w:b w:val="0"/>
-          <w:i w:val="0"/>
-          <w:sz w:val="24"/>
-        </w:rPr>
-        <w:t>Crystal Design TPL khảo sát mặt bằng và dựng phương án 3D miễn phí — doanh nghiệp sẽ thấy rõ mặt bằng của mình bố trí được bao nhiêu chỗ ngồi trước khi quyết định ngân sách.</w:t>
+        <w:t xml:space="preserve"> làm tốt là khi mỗi mét vuông bỏ đi đều đổi lại được một thứ doanh nghiệp thực sự cần. Crystal Design TPL khảo sát mặt bằng và dựng phương án 3D miễn phí, để doanh nghiệp thấy rõ mặt bằng của mình bố trí được bao nhiêu chỗ ngồi trước khi quyết định ngân sách.</w:t>
       </w:r>
     </w:p>
     <w:tbl>

</xml_diff>